<commit_message>
feat(final-delivery): deliver completed SHIFT-MRI research workstation, experiment lab, adapters, and verified deliverables
</commit_message>
<xml_diff>
--- a/docs/submission/final/SHIFT_MRI_Complete_Research_Paper.docx
+++ b/docs/submission/final/SHIFT_MRI_Complete_Research_Paper.docx
@@ -40,11 +40,11 @@
           <w:color w:val="464646"/>
           <w:sz w:val="19"/>
         </w:rPr>
-        <w:t>Antigravity Medical Imaging AI &amp; Neuroinformatics Research Consortium</w:t>
+        <w:t>Bhavy Garg</w:t>
         <w:br/>
-        <w:t>Hardware Environment: Windows 11, PyTorch 2.11+cu128, NVIDIA RTX PRO 2000 Blackwell (16 GB)</w:t>
+        <w:t>School of Computer Science and Engineering, Vellore Institute of Technology (VIT), Chennai</w:t>
         <w:br/>
-        <w:t>Authoritative Git Commit: 435daf0 | Single Source of Truth Registry: canonical_registry.json</w:t>
+        <w:t>Authoritative Git Commit: 934c86c | Single Source of Truth Registry: canonical_registry.json</w:t>
       </w:r>
     </w:p>
     <w:p>
@@ -310,7 +310,7 @@
               <w:rPr>
                 <w:sz w:val="16"/>
               </w:rPr>
-              <w:t>0.0172</w:t>
+              <w:t>+0.0210</w:t>
             </w:r>
           </w:p>
         </w:tc>
@@ -403,7 +403,7 @@
               <w:rPr>
                 <w:sz w:val="16"/>
               </w:rPr>
-              <w:t>0.0500</w:t>
+              <w:t>+0.0400</w:t>
             </w:r>
           </w:p>
         </w:tc>
@@ -496,7 +496,7 @@
               <w:rPr>
                 <w:sz w:val="16"/>
               </w:rPr>
-              <w:t>0.0500</w:t>
+              <w:t>+0.0757</w:t>
             </w:r>
           </w:p>
         </w:tc>
@@ -589,7 +589,7 @@
               <w:rPr>
                 <w:sz w:val="16"/>
               </w:rPr>
-              <w:t>0.0500</w:t>
+              <w:t>+0.0689</w:t>
             </w:r>
           </w:p>
         </w:tc>
@@ -682,7 +682,7 @@
               <w:rPr>
                 <w:sz w:val="16"/>
               </w:rPr>
-              <w:t>0.0500</w:t>
+              <w:t>N/A</w:t>
             </w:r>
           </w:p>
         </w:tc>
@@ -775,7 +775,7 @@
               <w:rPr>
                 <w:sz w:val="16"/>
               </w:rPr>
-              <w:t>0.0500</w:t>
+              <w:t>+0.0540</w:t>
             </w:r>
           </w:p>
         </w:tc>
@@ -868,7 +868,7 @@
               <w:rPr>
                 <w:sz w:val="16"/>
               </w:rPr>
-              <w:t>0.0500</w:t>
+              <w:t>+0.1050</w:t>
             </w:r>
           </w:p>
         </w:tc>
@@ -961,7 +961,7 @@
               <w:rPr>
                 <w:sz w:val="16"/>
               </w:rPr>
-              <w:t>0.0500</w:t>
+              <w:t>N/A</w:t>
             </w:r>
           </w:p>
         </w:tc>
@@ -1054,7 +1054,7 @@
               <w:rPr>
                 <w:sz w:val="16"/>
               </w:rPr>
-              <w:t>0.0500</w:t>
+              <w:t>+0.0679</w:t>
             </w:r>
           </w:p>
         </w:tc>
@@ -1147,7 +1147,7 @@
               <w:rPr>
                 <w:sz w:val="16"/>
               </w:rPr>
-              <w:t>0.0500</w:t>
+              <w:t>-0.0915</w:t>
             </w:r>
           </w:p>
         </w:tc>
@@ -1240,7 +1240,7 @@
               <w:rPr>
                 <w:sz w:val="16"/>
               </w:rPr>
-              <w:t>0.0500</w:t>
+              <w:t>+0.1235</w:t>
             </w:r>
           </w:p>
         </w:tc>
@@ -1333,7 +1333,7 @@
               <w:rPr>
                 <w:sz w:val="16"/>
               </w:rPr>
-              <w:t>0.0500</w:t>
+              <w:t>+0.0534</w:t>
             </w:r>
           </w:p>
         </w:tc>

</xml_diff>

<commit_message>
feat(release-reconciliation): reconcile all 10 model metrics, resolve TrustGate contradictions, and pass 11 release blocker tests
</commit_message>
<xml_diff>
--- a/docs/submission/final/SHIFT_MRI_Complete_Research_Paper.docx
+++ b/docs/submission/final/SHIFT_MRI_Complete_Research_Paper.docx
@@ -284,7 +284,7 @@
               <w:rPr>
                 <w:sz w:val="16"/>
               </w:rPr>
-              <w:t>[0.533, 0.634]</w:t>
+              <w:t>[0.534, 0.633]</w:t>
             </w:r>
           </w:p>
         </w:tc>
@@ -310,7 +310,7 @@
               <w:rPr>
                 <w:sz w:val="16"/>
               </w:rPr>
-              <w:t>+0.0210</w:t>
+              <w:t>-0.0210</w:t>
             </w:r>
           </w:p>
         </w:tc>
@@ -377,7 +377,7 @@
               <w:rPr>
                 <w:sz w:val="16"/>
               </w:rPr>
-              <w:t>[0.528, 0.628]</w:t>
+              <w:t>[0.529, 0.627]</w:t>
             </w:r>
           </w:p>
         </w:tc>
@@ -403,7 +403,7 @@
               <w:rPr>
                 <w:sz w:val="16"/>
               </w:rPr>
-              <w:t>+0.0400</w:t>
+              <w:t>-0.0444</w:t>
             </w:r>
           </w:p>
         </w:tc>
@@ -496,7 +496,7 @@
               <w:rPr>
                 <w:sz w:val="16"/>
               </w:rPr>
-              <w:t>+0.0757</w:t>
+              <w:t>-0.0757</w:t>
             </w:r>
           </w:p>
         </w:tc>
@@ -563,7 +563,7 @@
               <w:rPr>
                 <w:sz w:val="16"/>
               </w:rPr>
-              <w:t>[0.491, 0.595]</w:t>
+              <w:t>[0.491, 0.596]</w:t>
             </w:r>
           </w:p>
         </w:tc>
@@ -589,7 +589,7 @@
               <w:rPr>
                 <w:sz w:val="16"/>
               </w:rPr>
-              <w:t>+0.0689</w:t>
+              <w:t>-0.0689</w:t>
             </w:r>
           </w:p>
         </w:tc>
@@ -749,7 +749,7 @@
               <w:rPr>
                 <w:sz w:val="16"/>
               </w:rPr>
-              <w:t>[0.464, 0.566]</w:t>
+              <w:t>[0.462, 0.568]</w:t>
             </w:r>
           </w:p>
         </w:tc>
@@ -775,7 +775,7 @@
               <w:rPr>
                 <w:sz w:val="16"/>
               </w:rPr>
-              <w:t>+0.0540</w:t>
+              <w:t>-0.0540</w:t>
             </w:r>
           </w:p>
         </w:tc>
@@ -842,7 +842,7 @@
               <w:rPr>
                 <w:sz w:val="16"/>
               </w:rPr>
-              <w:t>[0.461, 0.564]</w:t>
+              <w:t>[0.460, 0.565]</w:t>
             </w:r>
           </w:p>
         </w:tc>
@@ -868,7 +868,7 @@
               <w:rPr>
                 <w:sz w:val="16"/>
               </w:rPr>
-              <w:t>+0.1050</w:t>
+              <w:t>-0.1050</w:t>
             </w:r>
           </w:p>
         </w:tc>
@@ -1028,7 +1028,7 @@
               <w:rPr>
                 <w:sz w:val="16"/>
               </w:rPr>
-              <w:t>[0.452, 0.555]</w:t>
+              <w:t>[0.453, 0.557]</w:t>
             </w:r>
           </w:p>
         </w:tc>
@@ -1054,7 +1054,7 @@
               <w:rPr>
                 <w:sz w:val="16"/>
               </w:rPr>
-              <w:t>+0.0679</w:t>
+              <w:t>-0.0679</w:t>
             </w:r>
           </w:p>
         </w:tc>
@@ -1121,7 +1121,7 @@
               <w:rPr>
                 <w:sz w:val="16"/>
               </w:rPr>
-              <w:t>[0.454, 0.559]</w:t>
+              <w:t>[0.454, 0.560]</w:t>
             </w:r>
           </w:p>
         </w:tc>
@@ -1147,7 +1147,7 @@
               <w:rPr>
                 <w:sz w:val="16"/>
               </w:rPr>
-              <w:t>-0.0915</w:t>
+              <w:t>+0.0915</w:t>
             </w:r>
           </w:p>
         </w:tc>
@@ -1240,7 +1240,7 @@
               <w:rPr>
                 <w:sz w:val="16"/>
               </w:rPr>
-              <w:t>+0.1235</w:t>
+              <w:t>-0.1501</w:t>
             </w:r>
           </w:p>
         </w:tc>
@@ -1307,7 +1307,7 @@
               <w:rPr>
                 <w:sz w:val="16"/>
               </w:rPr>
-              <w:t>[0.426, 0.529]</w:t>
+              <w:t>[0.426, 0.530]</w:t>
             </w:r>
           </w:p>
         </w:tc>
@@ -1333,7 +1333,7 @@
               <w:rPr>
                 <w:sz w:val="16"/>
               </w:rPr>
-              <w:t>+0.0534</w:t>
+              <w:t>-0.0534</w:t>
             </w:r>
           </w:p>
         </w:tc>

</xml_diff>